<commit_message>
add maintenance scripts and q3 files
</commit_message>
<xml_diff>
--- a/Maintenance/2026/q2/Minutes/Q2 2026 Maintenance Meeting Minutes.docx
+++ b/Maintenance/2026/q2/Minutes/Q2 2026 Maintenance Meeting Minutes.docx
@@ -8,7 +8,7 @@
         <w:jc w:val="center"/>
       </w:pPr>
       <w:r>
-        <w:t>Maintenance Team Meeting — Minutes</w:t>
+        <w:t>Maintenance Team Meeting - Minutes</w:t>
       </w:r>
     </w:p>
     <w:p>
@@ -19,7 +19,7 @@
         <w:rPr>
           <w:i/>
         </w:rPr>
-        <w:t>Q2 2026 — Ashburton Kingdom Hall</w:t>
+        <w:t>Q2 2026 - Ashburton Kingdom Hall</w:t>
       </w:r>
     </w:p>
     <w:p>
@@ -349,7 +349,7 @@
         <w:pStyle w:val="Heading1"/>
       </w:pPr>
       <w:r>
-        <w:t>2. Follow-up Items — Status</w:t>
+        <w:t>2. Follow-up Items - Status</w:t>
       </w:r>
     </w:p>
     <w:tbl>
@@ -431,7 +431,7 @@
           </w:tcPr>
           <w:p>
             <w:r>
-              <w:t>Done — invoice sent</w:t>
+              <w:t>Done - invoice sent</w:t>
             </w:r>
           </w:p>
         </w:tc>
@@ -463,7 +463,7 @@
           </w:tcPr>
           <w:p>
             <w:r>
-              <w:t>Done — invoice sent</w:t>
+              <w:t>Done - invoice sent</w:t>
             </w:r>
           </w:p>
         </w:tc>
@@ -495,7 +495,7 @@
           </w:tcPr>
           <w:p>
             <w:r>
-              <w:t>In progress — Campbell to present</w:t>
+              <w:t>In progress - Campbell to present</w:t>
             </w:r>
           </w:p>
         </w:tc>
@@ -655,7 +655,7 @@
           </w:tcPr>
           <w:p>
             <w:r>
-              <w:t>Letter sent to Branch — decision pending: top-up vs replace</w:t>
+              <w:t>Letter sent to Branch - decision pending: top-up vs replace</w:t>
             </w:r>
           </w:p>
         </w:tc>
@@ -699,7 +699,7 @@
           </w:tcPr>
           <w:p>
             <w:r>
-              <w:t>BWoF compliance — IQP 12A forms</w:t>
+              <w:t>BWoF compliance - IQP 12A forms</w:t>
             </w:r>
           </w:p>
         </w:tc>
@@ -719,7 +719,7 @@
           </w:tcPr>
           <w:p>
             <w:r>
-              <w:t>Awaiting update — submission to compliance company</w:t>
+              <w:t>Awaiting update - submission to compliance company</w:t>
             </w:r>
           </w:p>
         </w:tc>
@@ -730,7 +730,7 @@
         <w:pStyle w:val="Heading1"/>
       </w:pPr>
       <w:r>
-        <w:t>3. Working Bee — Agreed</w:t>
+        <w:t>3. Working Bee - Agreed</w:t>
       </w:r>
     </w:p>
     <w:p>
@@ -770,7 +770,7 @@
         <w:rPr>
           <w:b w:val="0"/>
         </w:rPr>
-        <w:t>Each overseer reviewed Q2 job cards (April – June 2026). Job-card files are stored in the respective area subfolders under Maintenance/2026/q2/. Status to be updated by each overseer.</w:t>
+        <w:t>Each overseer reviewed Q2 job cards (April - June 2026). Job-card files are stored in the respective area subfolders under Maintenance/2026/q2/. Status to be updated by each overseer.</w:t>
       </w:r>
     </w:p>
     <w:p>
@@ -834,7 +834,7 @@
         <w:pStyle w:val="ListBullet"/>
       </w:pPr>
       <w:r>
-        <w:t>Civil (Maarten): Creche — foyer attendant to be more alert; water cooler with cups; add 2–3 chairs; breastfeeding toggle sign for foyer attendant.</w:t>
+        <w:t>Civil (Maarten): Creche - foyer attendant to be more alert; water cooler with cups; add 2-3 chairs; breastfeeding toggle sign for foyer attendant.</w:t>
       </w:r>
     </w:p>
     <w:p>
@@ -842,7 +842,7 @@
         <w:pStyle w:val="ListBullet"/>
       </w:pPr>
       <w:r>
-        <w:t>Electrical (Tyrone): Fresh-air intake fan rewired (part of heat pump). Main Hall aircon refrigerant — letter sent to Branch.</w:t>
+        <w:t>Electrical (Tyrone): Fresh-air intake fan rewired (part of heat pump). Main Hall aircon refrigerant - letter sent to Branch.</w:t>
       </w:r>
     </w:p>
     <w:p>
@@ -882,7 +882,7 @@
         <w:pStyle w:val="ListBullet"/>
       </w:pPr>
       <w:r>
-        <w:t>Security Systems — pending approval.</w:t>
+        <w:t>Security Systems - pending approval.</w:t>
       </w:r>
     </w:p>
     <w:p>
@@ -1263,7 +1263,7 @@
         <w:rPr>
           <w:b/>
         </w:rPr>
-        <w:t>Sunday, 5 or 12 July 2026 — 3:00 PM at Maarten's place (or earlier if needed).</w:t>
+        <w:t>Sunday, 5 or 12 July 2026 - 3:00 PM at Maarten's place (or earlier if needed).</w:t>
       </w:r>
     </w:p>
     <w:p>
@@ -1295,7 +1295,7 @@
         <w:pStyle w:val="ListBullet"/>
       </w:pPr>
       <w:r>
-        <w:t>Q2 2026 Maintenance Meeting Agenda.pdf — original pre-meeting agenda</w:t>
+        <w:t>Q2 2026 Maintenance Meeting Agenda.pdf - original pre-meeting agenda</w:t>
       </w:r>
     </w:p>
     <w:p>
@@ -1303,10 +1303,12 @@
         <w:pStyle w:val="ListBullet"/>
       </w:pPr>
       <w:r>
-        <w:t>Q2 2026 Maintenance Meeting Agenda.docx — updated post-discussion version</w:t>
+        <w:t>Q2 2026 Maintenance Meeting Agenda.docx - updated post-discussion version</w:t>
       </w:r>
     </w:p>
     <w:sectPr>
+      <w:headerReference w:type="default" r:id="rId9"/>
+      <w:footerReference w:type="default" r:id="rId10"/>
       <w:pgSz w:w="12240" w:h="15840"/>
       <w:pgMar w:top="1440" w:right="1800" w:bottom="1440" w:left="1800" w:header="720" w:footer="720" w:gutter="0"/>
       <w:cols w:space="720"/>
@@ -1314,6 +1316,26 @@
     </w:sectPr>
   </w:body>
 </w:document>
+</file>
+
+<file path=word/footer1.xml><?xml version="1.0" encoding="utf-8"?>
+<w:ftr xmlns:m="http://schemas.openxmlformats.org/officeDocument/2006/math" xmlns:mc="http://schemas.openxmlformats.org/markup-compatibility/2006" xmlns:mo="http://schemas.microsoft.com/office/mac/office/2008/main" xmlns:mv="urn:schemas-microsoft-com:mac:vml" xmlns:o="urn:schemas-microsoft-com:office:office" xmlns:r="http://schemas.openxmlformats.org/officeDocument/2006/relationships" xmlns:v="urn:schemas-microsoft-com:vml" xmlns:w10="urn:schemas-microsoft-com:office:word" xmlns:w14="http://schemas.microsoft.com/office/word/2010/wordml" xmlns:w="http://schemas.openxmlformats.org/wordprocessingml/2006/main" xmlns:wne="http://schemas.microsoft.com/office/word/2006/wordml" xmlns:wp14="http://schemas.microsoft.com/office/word/2010/wordprocessingDrawing" xmlns:wp="http://schemas.openxmlformats.org/drawingml/2006/wordprocessingDrawing" xmlns:wpc="http://schemas.microsoft.com/office/word/2010/wordprocessingCanvas" xmlns:wpg="http://schemas.microsoft.com/office/word/2010/wordprocessingGroup" xmlns:wpi="http://schemas.microsoft.com/office/word/2010/wordprocessingInk" xmlns:wps="http://schemas.microsoft.com/office/word/2010/wordprocessingShape" mc:Ignorable="w14 wp14">
+  <w:p>
+    <w:pPr>
+      <w:pStyle w:val="Footer"/>
+    </w:pPr>
+  </w:p>
+</w:ftr>
+</file>
+
+<file path=word/header1.xml><?xml version="1.0" encoding="utf-8"?>
+<w:hdr xmlns:m="http://schemas.openxmlformats.org/officeDocument/2006/math" xmlns:mc="http://schemas.openxmlformats.org/markup-compatibility/2006" xmlns:mo="http://schemas.microsoft.com/office/mac/office/2008/main" xmlns:mv="urn:schemas-microsoft-com:mac:vml" xmlns:o="urn:schemas-microsoft-com:office:office" xmlns:r="http://schemas.openxmlformats.org/officeDocument/2006/relationships" xmlns:v="urn:schemas-microsoft-com:vml" xmlns:w10="urn:schemas-microsoft-com:office:word" xmlns:w14="http://schemas.microsoft.com/office/word/2010/wordml" xmlns:w="http://schemas.openxmlformats.org/wordprocessingml/2006/main" xmlns:wne="http://schemas.microsoft.com/office/word/2006/wordml" xmlns:wp14="http://schemas.microsoft.com/office/word/2010/wordprocessingDrawing" xmlns:wp="http://schemas.openxmlformats.org/drawingml/2006/wordprocessingDrawing" xmlns:wpc="http://schemas.microsoft.com/office/word/2010/wordprocessingCanvas" xmlns:wpg="http://schemas.microsoft.com/office/word/2010/wordprocessingGroup" xmlns:wpi="http://schemas.microsoft.com/office/word/2010/wordprocessingInk" xmlns:wps="http://schemas.microsoft.com/office/word/2010/wordprocessingShape" mc:Ignorable="w14 wp14">
+  <w:p>
+    <w:pPr>
+      <w:pStyle w:val="Header"/>
+    </w:pPr>
+  </w:p>
+</w:hdr>
 </file>
 
 <file path=word/numbering.xml><?xml version="1.0" encoding="utf-8"?>

</xml_diff>